<commit_message>
Use Battambang for Khmer heading styles
</commit_message>
<xml_diff>
--- a/new/km-KH/new.docx
+++ b/new/km-KH/new.docx
@@ -218,6 +218,285 @@
       <w:contextualSpacing/>
     </w:pPr>
   </w:style>
+  <w:style w:type="paragraph" w:styleId="Heading1">
+    <w:name w:val="heading 1"/>
+    <w:basedOn w:val="a"/>
+    <w:next w:val="a"/>
+    <w:link w:val="Heading1Char"/>
+    <w:uiPriority w:val="9"/>
+    <w:qFormat/>
+    <w:pPr>
+      <w:keepNext/>
+      <w:keepLines/>
+      <w:spacing w:before="360" w:after="80"/>
+      <w:outlineLvl w:val="0"/>
+    </w:pPr>
+    <w:rPr>
+      <w:rFonts w:ascii="Khmer OS Battambang" w:hAnsi="Khmer OS Battambang" w:eastAsia="Khmer OS Battambang" w:cs="Khmer OS Battambang"/>
+      <w:sz w:val="40"/>
+      <w:szCs w:val="40"/>
+      <w:color w:val="0F4761"/>
+    </w:rPr>
+  </w:style>
+  <w:style w:type="character" w:styleId="Heading1Char">
+    <w:name w:val="heading 1 char"/>
+    <w:link w:val="Heading1"/>
+    <w:uiPriority w:val="9"/>
+    <w:rPr>
+      <w:rFonts w:ascii="Khmer OS Battambang" w:hAnsi="Khmer OS Battambang" w:eastAsia="Khmer OS Battambang" w:cs="Khmer OS Battambang"/>
+      <w:sz w:val="40"/>
+      <w:szCs w:val="40"/>
+      <w:color w:val="0F4761"/>
+    </w:rPr>
+  </w:style>
+  <w:style w:type="paragraph" w:styleId="Heading2">
+    <w:name w:val="heading 2"/>
+    <w:basedOn w:val="a"/>
+    <w:next w:val="a"/>
+    <w:link w:val="Heading2Char"/>
+    <w:uiPriority w:val="9"/>
+    <w:unhideWhenUsed/>
+    <w:qFormat/>
+    <w:pPr>
+      <w:keepNext/>
+      <w:keepLines/>
+      <w:spacing w:before="160" w:after="80"/>
+      <w:outlineLvl w:val="1"/>
+    </w:pPr>
+    <w:rPr>
+      <w:rFonts w:ascii="Khmer OS Battambang" w:hAnsi="Khmer OS Battambang" w:eastAsia="Khmer OS Battambang" w:cs="Khmer OS Battambang"/>
+      <w:sz w:val="32"/>
+      <w:szCs w:val="32"/>
+      <w:color w:val="0F4761"/>
+    </w:rPr>
+  </w:style>
+  <w:style w:type="character" w:styleId="Heading2Char">
+    <w:name w:val="heading 2 char"/>
+    <w:link w:val="Heading2"/>
+    <w:uiPriority w:val="9"/>
+    <w:rPr>
+      <w:rFonts w:ascii="Khmer OS Battambang" w:hAnsi="Khmer OS Battambang" w:eastAsia="Khmer OS Battambang" w:cs="Khmer OS Battambang"/>
+      <w:sz w:val="32"/>
+      <w:szCs w:val="32"/>
+      <w:color w:val="0F4761"/>
+    </w:rPr>
+  </w:style>
+  <w:style w:type="paragraph" w:styleId="Heading3">
+    <w:name w:val="heading 3"/>
+    <w:basedOn w:val="a"/>
+    <w:next w:val="a"/>
+    <w:link w:val="Heading3Char"/>
+    <w:uiPriority w:val="9"/>
+    <w:unhideWhenUsed/>
+    <w:qFormat/>
+    <w:pPr>
+      <w:keepNext/>
+      <w:keepLines/>
+      <w:spacing w:before="160" w:after="80"/>
+      <w:outlineLvl w:val="2"/>
+    </w:pPr>
+    <w:rPr>
+      <w:rFonts w:ascii="Khmer OS Battambang" w:hAnsi="Khmer OS Battambang" w:eastAsia="Khmer OS Battambang" w:cs="Khmer OS Battambang"/>
+      <w:sz w:val="28"/>
+      <w:szCs w:val="28"/>
+      <w:color w:val="0F4761"/>
+    </w:rPr>
+  </w:style>
+  <w:style w:type="character" w:styleId="Heading3Char">
+    <w:name w:val="heading 3 char"/>
+    <w:link w:val="Heading3"/>
+    <w:uiPriority w:val="9"/>
+    <w:rPr>
+      <w:rFonts w:ascii="Khmer OS Battambang" w:hAnsi="Khmer OS Battambang" w:eastAsia="Khmer OS Battambang" w:cs="Khmer OS Battambang"/>
+      <w:sz w:val="28"/>
+      <w:szCs w:val="28"/>
+      <w:color w:val="0F4761"/>
+    </w:rPr>
+  </w:style>
+  <w:style w:type="paragraph" w:styleId="Heading4">
+    <w:name w:val="heading 4"/>
+    <w:basedOn w:val="a"/>
+    <w:next w:val="a"/>
+    <w:link w:val="Heading4Char"/>
+    <w:uiPriority w:val="9"/>
+    <w:unhideWhenUsed/>
+    <w:qFormat/>
+    <w:pPr>
+      <w:keepNext/>
+      <w:keepLines/>
+      <w:spacing w:before="80" w:after="40"/>
+      <w:outlineLvl w:val="3"/>
+    </w:pPr>
+    <w:rPr>
+      <w:rFonts w:ascii="Khmer OS Battambang" w:hAnsi="Khmer OS Battambang" w:eastAsia="Khmer OS Battambang" w:cs="Khmer OS Battambang"/>
+      <w:color w:val="0F4761"/>
+      <w:i/>
+      <w:iCs/>
+    </w:rPr>
+  </w:style>
+  <w:style w:type="character" w:styleId="Heading4Char">
+    <w:name w:val="heading 4 char"/>
+    <w:link w:val="Heading4"/>
+    <w:uiPriority w:val="9"/>
+    <w:rPr>
+      <w:rFonts w:ascii="Khmer OS Battambang" w:hAnsi="Khmer OS Battambang" w:eastAsia="Khmer OS Battambang" w:cs="Khmer OS Battambang"/>
+      <w:color w:val="0F4761"/>
+      <w:i/>
+      <w:iCs/>
+    </w:rPr>
+  </w:style>
+  <w:style w:type="paragraph" w:styleId="Heading5">
+    <w:name w:val="heading 5"/>
+    <w:basedOn w:val="a"/>
+    <w:next w:val="a"/>
+    <w:link w:val="Heading5Char"/>
+    <w:uiPriority w:val="9"/>
+    <w:unhideWhenUsed/>
+    <w:qFormat/>
+    <w:pPr>
+      <w:keepNext/>
+      <w:keepLines/>
+      <w:spacing w:before="80" w:after="40"/>
+      <w:outlineLvl w:val="4"/>
+    </w:pPr>
+    <w:rPr>
+      <w:rFonts w:ascii="Khmer OS Battambang" w:hAnsi="Khmer OS Battambang" w:eastAsia="Khmer OS Battambang" w:cs="Khmer OS Battambang"/>
+      <w:color w:val="0F4761"/>
+    </w:rPr>
+  </w:style>
+  <w:style w:type="character" w:styleId="Heading5Char">
+    <w:name w:val="heading 5 char"/>
+    <w:link w:val="Heading5"/>
+    <w:uiPriority w:val="9"/>
+    <w:rPr>
+      <w:rFonts w:ascii="Khmer OS Battambang" w:hAnsi="Khmer OS Battambang" w:eastAsia="Khmer OS Battambang" w:cs="Khmer OS Battambang"/>
+      <w:color w:val="0F4761"/>
+    </w:rPr>
+  </w:style>
+  <w:style w:type="paragraph" w:styleId="Heading6">
+    <w:name w:val="heading 6"/>
+    <w:basedOn w:val="a"/>
+    <w:next w:val="a"/>
+    <w:link w:val="Heading6Char"/>
+    <w:uiPriority w:val="9"/>
+    <w:unhideWhenUsed/>
+    <w:qFormat/>
+    <w:pPr>
+      <w:keepNext/>
+      <w:keepLines/>
+      <w:spacing w:before="40" w:after="0"/>
+      <w:outlineLvl w:val="5"/>
+    </w:pPr>
+    <w:rPr>
+      <w:rFonts w:ascii="Khmer OS Battambang" w:hAnsi="Khmer OS Battambang" w:eastAsia="Khmer OS Battambang" w:cs="Khmer OS Battambang"/>
+      <w:color w:val="595959"/>
+      <w:i/>
+      <w:iCs/>
+    </w:rPr>
+  </w:style>
+  <w:style w:type="character" w:styleId="Heading6Char">
+    <w:name w:val="heading 6 char"/>
+    <w:link w:val="Heading6"/>
+    <w:uiPriority w:val="9"/>
+    <w:rPr>
+      <w:rFonts w:ascii="Khmer OS Battambang" w:hAnsi="Khmer OS Battambang" w:eastAsia="Khmer OS Battambang" w:cs="Khmer OS Battambang"/>
+      <w:color w:val="595959"/>
+      <w:i/>
+      <w:iCs/>
+    </w:rPr>
+  </w:style>
+  <w:style w:type="paragraph" w:styleId="Heading7">
+    <w:name w:val="heading 7"/>
+    <w:basedOn w:val="a"/>
+    <w:next w:val="a"/>
+    <w:link w:val="Heading7Char"/>
+    <w:uiPriority w:val="9"/>
+    <w:unhideWhenUsed/>
+    <w:qFormat/>
+    <w:pPr>
+      <w:keepNext/>
+      <w:keepLines/>
+      <w:spacing w:before="40" w:after="0"/>
+      <w:outlineLvl w:val="6"/>
+    </w:pPr>
+    <w:rPr>
+      <w:rFonts w:ascii="Khmer OS Battambang" w:hAnsi="Khmer OS Battambang" w:eastAsia="Khmer OS Battambang" w:cs="Khmer OS Battambang"/>
+      <w:color w:val="595959"/>
+    </w:rPr>
+  </w:style>
+  <w:style w:type="character" w:styleId="Heading7Char">
+    <w:name w:val="heading 7 char"/>
+    <w:link w:val="Heading7"/>
+    <w:uiPriority w:val="9"/>
+    <w:rPr>
+      <w:rFonts w:ascii="Khmer OS Battambang" w:hAnsi="Khmer OS Battambang" w:eastAsia="Khmer OS Battambang" w:cs="Khmer OS Battambang"/>
+      <w:color w:val="595959"/>
+    </w:rPr>
+  </w:style>
+  <w:style w:type="paragraph" w:styleId="Heading8">
+    <w:name w:val="heading 8"/>
+    <w:basedOn w:val="a"/>
+    <w:next w:val="a"/>
+    <w:link w:val="Heading8Char"/>
+    <w:uiPriority w:val="9"/>
+    <w:unhideWhenUsed/>
+    <w:qFormat/>
+    <w:pPr>
+      <w:keepNext/>
+      <w:keepLines/>
+      <w:spacing w:after="0"/>
+      <w:outlineLvl w:val="7"/>
+    </w:pPr>
+    <w:rPr>
+      <w:rFonts w:ascii="Khmer OS Battambang" w:hAnsi="Khmer OS Battambang" w:eastAsia="Khmer OS Battambang" w:cs="Khmer OS Battambang"/>
+      <w:color w:val="272727"/>
+      <w:i/>
+      <w:iCs/>
+    </w:rPr>
+  </w:style>
+  <w:style w:type="character" w:styleId="Heading8Char">
+    <w:name w:val="heading 8 char"/>
+    <w:link w:val="Heading8"/>
+    <w:uiPriority w:val="9"/>
+    <w:rPr>
+      <w:rFonts w:ascii="Khmer OS Battambang" w:hAnsi="Khmer OS Battambang" w:eastAsia="Khmer OS Battambang" w:cs="Khmer OS Battambang"/>
+      <w:color w:val="272727"/>
+      <w:i/>
+      <w:iCs/>
+    </w:rPr>
+  </w:style>
+  <w:style w:type="paragraph" w:styleId="Heading9">
+    <w:name w:val="heading 9"/>
+    <w:basedOn w:val="a"/>
+    <w:next w:val="a"/>
+    <w:link w:val="Heading9Char"/>
+    <w:uiPriority w:val="9"/>
+    <w:unhideWhenUsed/>
+    <w:qFormat/>
+    <w:pPr>
+      <w:keepNext/>
+      <w:keepLines/>
+      <w:spacing w:after="0"/>
+      <w:outlineLvl w:val="8"/>
+    </w:pPr>
+    <w:rPr>
+      <w:rFonts w:ascii="Khmer OS Battambang" w:hAnsi="Khmer OS Battambang" w:eastAsia="Khmer OS Battambang" w:cs="Khmer OS Battambang"/>
+      <w:color w:val="272727"/>
+      <w:i/>
+      <w:iCs/>
+    </w:rPr>
+  </w:style>
+  <w:style w:type="character" w:styleId="Heading9Char">
+    <w:name w:val="heading 9 char"/>
+    <w:link w:val="Heading9"/>
+    <w:uiPriority w:val="9"/>
+    <w:rPr>
+      <w:rFonts w:ascii="Khmer OS Battambang" w:hAnsi="Khmer OS Battambang" w:eastAsia="Khmer OS Battambang" w:cs="Khmer OS Battambang"/>
+      <w:color w:val="272727"/>
+      <w:i/>
+      <w:iCs/>
+    </w:rPr>
+  </w:style>
 </w:styles>
 </file>
 

</xml_diff>